<commit_message>
Testler: uyarılı açılış fikstürü P3.2'ye uyarlandı; Windows'ta 200 yazma testine 120 sn
- e2e-masaustu/fixtures/uyarili-nesne.docx: boş w:object artık opak öğe olarak korunduğu için
  açılış uyarısı vermiyordu ve otomatik kaydetme bekletme testi düşüyordu. Nesneye pakette
  olmayan bir ilişki (rId999) verildi: korunamaz, uyarı sürer (saglamlik.test.ts ile aynı yol).
- safeWrite: 'aynı dosyaya eşzamanlı 200 yazma' Windows koşucusunda 60 sn'yi aştı; yandaki
  yarış testi gibi açık 120 sn süre. Doğrulamalar aynı.
</commit_message>
<xml_diff>
--- a/e2e-masaustu/fixtures/uyarili-nesne.docx
+++ b/e2e-masaustu/fixtures/uyarili-nesne.docx
@@ -12,7 +12,9 @@
         <w:t>2026 Yılı Dijital Dönüşüm Projesi</w:t>
       </w:r>
       <w:r>
-        <w:object w:dxaOrig="1440" w:dyaOrig="1440"/>
+        <w:object w:dxaOrig="1440" w:dyaOrig="1440">
+          <o:OLEObject ProgID="Paket" r:id="rId999"/>
+        </w:object>
       </w:r>
     </w:p>
     <w:p>

</xml_diff>